<commit_message>
color marking on not PII made green
</commit_message>
<xml_diff>
--- a/defensive-publications/partial-encryption-full-signature.docx
+++ b/defensive-publications/partial-encryption-full-signature.docx
@@ -1,6 +1,6 @@
 
 <file path=word/document.xml><?xml version="1.0" encoding="utf-8"?>
-<w:document xmlns:wpc="http://schemas.microsoft.com/office/word/2010/wordprocessingCanvas" xmlns:cx="http://schemas.microsoft.com/office/drawing/2014/chartex" xmlns:cx1="http://schemas.microsoft.com/office/drawing/2015/9/8/chartex" xmlns:cx2="http://schemas.microsoft.com/office/drawing/2015/10/21/chartex" xmlns:cx3="http://schemas.microsoft.com/office/drawing/2016/5/9/chartex" xmlns:cx4="http://schemas.microsoft.com/office/drawing/2016/5/10/chartex" xmlns:cx5="http://schemas.microsoft.com/office/drawing/2016/5/11/chartex" xmlns:cx6="http://schemas.microsoft.com/office/drawing/2016/5/12/chartex" xmlns:cx7="http://schemas.microsoft.com/office/drawing/2016/5/13/chartex" xmlns:cx8="http://schemas.microsoft.com/office/drawing/2016/5/14/chartex" xmlns:mc="http://schemas.openxmlformats.org/markup-compatibility/2006" xmlns:aink="http://schemas.microsoft.com/office/drawing/2016/ink" xmlns:am3d="http://schemas.microsoft.com/office/drawing/2017/model3d" xmlns:o="urn:schemas-microsoft-com:office:office" xmlns:oel="http://schemas.microsoft.com/office/2019/extlst" xmlns:r="http://schemas.openxmlformats.org/officeDocument/2006/relationships" xmlns:m="http://schemas.openxmlformats.org/officeDocument/2006/math" xmlns:v="urn:schemas-microsoft-com:vml" xmlns:wp14="http://schemas.microsoft.com/office/word/2010/wordprocessingDrawing" xmlns:wp="http://schemas.openxmlformats.org/drawingml/2006/wordprocessingDrawing" xmlns:w10="urn:schemas-microsoft-com:office:word" xmlns:w="http://schemas.openxmlformats.org/wordprocessingml/2006/main" xmlns:w14="http://schemas.microsoft.com/office/word/2010/wordml" xmlns:w15="http://schemas.microsoft.com/office/word/2012/wordml" xmlns:w16cex="http://schemas.microsoft.com/office/word/2018/wordml/cex" xmlns:w16cid="http://schemas.microsoft.com/office/word/2016/wordml/cid" xmlns:w16="http://schemas.microsoft.com/office/word/2018/wordml" xmlns:w16du="http://schemas.microsoft.com/office/word/2023/wordml/word16du" xmlns:w16sdtdh="http://schemas.microsoft.com/office/word/2020/wordml/sdtdatahash" xmlns:w16sdtfl="http://schemas.microsoft.com/office/word/2024/wordml/sdtformatlock" xmlns:w16se="http://schemas.microsoft.com/office/word/2015/wordml/symex" xmlns:wpg="http://schemas.microsoft.com/office/word/2010/wordprocessingGroup" xmlns:wpi="http://schemas.microsoft.com/office/word/2010/wordprocessingInk" xmlns:wne="http://schemas.microsoft.com/office/word/2006/wordml" xmlns:wps="http://schemas.microsoft.com/office/word/2010/wordprocessingShape" mc:Ignorable="w14 w15 w16se w16cid w16 w16cex w16sdtdh w16sdtfl w16du wp14">
+<w:document xmlns:wpc="http://schemas.microsoft.com/office/word/2010/wordprocessingCanvas" xmlns:cx="http://schemas.microsoft.com/office/drawing/2014/chartex" xmlns:cx1="http://schemas.microsoft.com/office/drawing/2015/9/8/chartex" xmlns:cx2="http://schemas.microsoft.com/office/drawing/2015/10/21/chartex" xmlns:cx3="http://schemas.microsoft.com/office/drawing/2016/5/9/chartex" xmlns:cx4="http://schemas.microsoft.com/office/drawing/2016/5/10/chartex" xmlns:cx5="http://schemas.microsoft.com/office/drawing/2016/5/11/chartex" xmlns:cx6="http://schemas.microsoft.com/office/drawing/2016/5/12/chartex" xmlns:cx7="http://schemas.microsoft.com/office/drawing/2016/5/13/chartex" xmlns:cx8="http://schemas.microsoft.com/office/drawing/2016/5/14/chartex" xmlns:mc="http://schemas.openxmlformats.org/markup-compatibility/2006" xmlns:m="http://schemas.openxmlformats.org/officeDocument/2006/math" xmlns:aink="http://schemas.microsoft.com/office/drawing/2016/ink" xmlns:am3d="http://schemas.microsoft.com/office/drawing/2017/model3d" xmlns:oel="http://schemas.microsoft.com/office/2019/extlst" xmlns:r="http://schemas.openxmlformats.org/officeDocument/2006/relationships" xmlns:wp14="http://schemas.microsoft.com/office/word/2010/wordprocessingDrawing" xmlns:wp="http://schemas.openxmlformats.org/drawingml/2006/wordprocessingDrawing" xmlns:wpg="http://schemas.microsoft.com/office/word/2010/wordprocessingGroup" xmlns:wpi="http://schemas.microsoft.com/office/word/2010/wordprocessingInk" xmlns:wps="http://schemas.microsoft.com/office/word/2010/wordprocessingShape" xmlns:o="urn:schemas-microsoft-com:office:office" xmlns:v="urn:schemas-microsoft-com:vml" xmlns:w10="urn:schemas-microsoft-com:office:word" xmlns:w="http://schemas.openxmlformats.org/wordprocessingml/2006/main" xmlns:w14="http://schemas.microsoft.com/office/word/2010/wordml" xmlns:w15="http://schemas.microsoft.com/office/word/2012/wordml" xmlns:w16cex="http://schemas.microsoft.com/office/word/2018/wordml/cex" xmlns:w16cid="http://schemas.microsoft.com/office/word/2016/wordml/cid" xmlns:w16="http://schemas.microsoft.com/office/word/2018/wordml" xmlns:w16sdtdh="http://schemas.microsoft.com/office/word/2020/wordml/sdtdatahash" xmlns:w16sdtfl="http://schemas.microsoft.com/office/word/2024/wordml/sdtformatlock" xmlns:w16se="http://schemas.microsoft.com/office/word/2015/wordml/symex" xmlns:w16du="http://schemas.microsoft.com/office/word/2023/wordml/word16du" xmlns:wne="http://schemas.microsoft.com/office/word/2006/wordml" mc:Ignorable="w14 w15 w16se w16cid w16 w16cex w16sdtdh w16sdtfl w16du wp14">
   <w:body>
     <w:p>
       <w:pPr>
@@ -26,7 +26,7 @@
         <mc:AlternateContent>
           <mc:Choice Requires="wps">
             <w:drawing>
-              <wp:anchor distT="0" distB="0" distL="114300" distR="114300" simplePos="0" relativeHeight="251658240" behindDoc="0" locked="0" layoutInCell="1" allowOverlap="1">
+              <wp:anchor distT="0" distB="0" distL="114300" distR="114300" simplePos="0" relativeHeight="251658240" behindDoc="0" locked="0" layoutInCell="1" allowOverlap="1" wp14:anchorId="7ECF17C9" wp14:editId="69D06F6E">
                 <wp:simplePos x="0" y="0"/>
                 <wp:positionH relativeFrom="column">
                   <wp:posOffset>6075825</wp:posOffset>
@@ -1481,7 +1481,7 @@
           <w:szCs w:val="20"/>
         </w:rPr>
         <w:drawing>
-          <wp:inline distT="0" distB="0" distL="0" distR="0">
+          <wp:inline distT="0" distB="0" distL="0" distR="0" wp14:anchorId="7C4FC113" wp14:editId="1AAEE83F">
             <wp:extent cx="6402779" cy="4135556"/>
             <wp:effectExtent l="38100" t="38100" r="86995" b="93980"/>
             <wp:docPr id="1865902517" name="Picture 16"/>
@@ -1879,7 +1879,7 @@
         <mc:AlternateContent>
           <mc:Choice Requires="wps">
             <w:drawing>
-              <wp:anchor distT="0" distB="0" distL="114300" distR="114300" simplePos="0" relativeHeight="251666432" behindDoc="0" locked="0" layoutInCell="1" allowOverlap="1">
+              <wp:anchor distT="0" distB="0" distL="114300" distR="114300" simplePos="0" relativeHeight="251666432" behindDoc="0" locked="0" layoutInCell="1" allowOverlap="1" wp14:anchorId="43107368" wp14:editId="6928314C">
                 <wp:simplePos x="0" y="0"/>
                 <wp:positionH relativeFrom="column">
                   <wp:posOffset>2787015</wp:posOffset>
@@ -2005,7 +2005,7 @@
         <mc:AlternateContent>
           <mc:Choice Requires="wps">
             <w:drawing>
-              <wp:anchor distT="0" distB="0" distL="114300" distR="114300" simplePos="0" relativeHeight="251665408" behindDoc="0" locked="0" layoutInCell="1" allowOverlap="1">
+              <wp:anchor distT="0" distB="0" distL="114300" distR="114300" simplePos="0" relativeHeight="251665408" behindDoc="0" locked="0" layoutInCell="1" allowOverlap="1" wp14:anchorId="45F82C9E" wp14:editId="5CD4747A">
                 <wp:simplePos x="0" y="0"/>
                 <wp:positionH relativeFrom="column">
                   <wp:posOffset>2505607</wp:posOffset>
@@ -2098,7 +2098,7 @@
         <mc:AlternateContent>
           <mc:Choice Requires="wps">
             <w:drawing>
-              <wp:inline distT="0" distB="0" distL="0" distR="0">
+              <wp:inline distT="0" distB="0" distL="0" distR="0" wp14:anchorId="5D85464F" wp14:editId="5CE7244E">
                 <wp:extent cx="6438585" cy="306729"/>
                 <wp:effectExtent l="25400" t="25400" r="102235" b="100330"/>
                 <wp:docPr id="2076485572" name="Text Box 17"/>
@@ -8380,7 +8380,7 @@
                               <w:rPr>
                                 <w:rFonts w:ascii="Consolas" w:hAnsi="Consolas" w:cs="Consolas"/>
                                 <w:noProof/>
-                                <w:color w:val="E36C0A" w:themeColor="accent6" w:themeShade="BF"/>
+                                <w:color w:val="00B050"/>
                                 <w:sz w:val="20"/>
                                 <w:szCs w:val="20"/>
                               </w:rPr>
@@ -8390,7 +8390,7 @@
                               <w:rPr>
                                 <w:rFonts w:ascii="Consolas" w:hAnsi="Consolas" w:cs="Consolas"/>
                                 <w:noProof/>
-                                <w:color w:val="E36C0A" w:themeColor="accent6" w:themeShade="BF"/>
+                                <w:color w:val="00B050"/>
                                 <w:sz w:val="20"/>
                                 <w:szCs w:val="20"/>
                               </w:rPr>
@@ -8400,7 +8400,7 @@
                               <w:rPr>
                                 <w:rFonts w:ascii="Consolas" w:hAnsi="Consolas" w:cs="Consolas"/>
                                 <w:noProof/>
-                                <w:color w:val="E36C0A" w:themeColor="accent6" w:themeShade="BF"/>
+                                <w:color w:val="00B050"/>
                                 <w:sz w:val="20"/>
                                 <w:szCs w:val="20"/>
                               </w:rPr>
@@ -8479,37 +8479,17 @@
                               <w:rPr>
                                 <w:rFonts w:ascii="Consolas" w:hAnsi="Consolas" w:cs="Consolas"/>
                                 <w:noProof/>
-                                <w:color w:val="E36C0A" w:themeColor="accent6" w:themeShade="BF"/>
-                                <w:sz w:val="20"/>
-                                <w:szCs w:val="20"/>
-                              </w:rPr>
-                              <w:t xml:space="preserve"># </w:t>
-                            </w:r>
-                            <w:r>
-                              <w:rPr>
-                                <w:rFonts w:ascii="Consolas" w:hAnsi="Consolas" w:cs="Consolas"/>
-                                <w:noProof/>
-                                <w:color w:val="E36C0A" w:themeColor="accent6" w:themeShade="BF"/>
-                                <w:sz w:val="20"/>
-                                <w:szCs w:val="20"/>
-                              </w:rPr>
-                              <w:t>Ephemeral</w:t>
-                            </w:r>
-                            <w:r>
-                              <w:rPr>
-                                <w:rFonts w:ascii="Consolas" w:hAnsi="Consolas" w:cs="Consolas"/>
-                                <w:noProof/>
-                                <w:color w:val="E36C0A" w:themeColor="accent6" w:themeShade="BF"/>
-                                <w:sz w:val="20"/>
-                                <w:szCs w:val="20"/>
-                              </w:rPr>
-                              <w:t xml:space="preserve"> </w:t>
-                            </w:r>
-                            <w:r>
-                              <w:rPr>
-                                <w:rFonts w:ascii="Consolas" w:hAnsi="Consolas" w:cs="Consolas"/>
-                                <w:noProof/>
-                                <w:color w:val="E36C0A" w:themeColor="accent6" w:themeShade="BF"/>
+                                <w:color w:val="00B050"/>
+                                <w:sz w:val="20"/>
+                                <w:szCs w:val="20"/>
+                              </w:rPr>
+                              <w:t xml:space="preserve"># Ephemeral </w:t>
+                            </w:r>
+                            <w:r>
+                              <w:rPr>
+                                <w:rFonts w:ascii="Consolas" w:hAnsi="Consolas" w:cs="Consolas"/>
+                                <w:noProof/>
+                                <w:color w:val="00B050"/>
                                 <w:sz w:val="20"/>
                                 <w:szCs w:val="20"/>
                               </w:rPr>
@@ -8519,7 +8499,7 @@
                               <w:rPr>
                                 <w:rFonts w:ascii="Consolas" w:hAnsi="Consolas" w:cs="Consolas"/>
                                 <w:noProof/>
-                                <w:color w:val="E36C0A" w:themeColor="accent6" w:themeShade="BF"/>
+                                <w:color w:val="00B050"/>
                                 <w:sz w:val="20"/>
                                 <w:szCs w:val="20"/>
                               </w:rPr>
@@ -8710,7 +8690,7 @@
                 <v:stroke joinstyle="miter"/>
                 <v:path gradientshapeok="t" o:connecttype="rect"/>
               </v:shapetype>
-              <v:shape id="_x0000_s1033" type="#_x0000_t202" style="width:507pt;height:24.15pt;visibility:visible;mso-wrap-style:square;mso-left-percent:-10001;mso-top-percent:-10001;mso-position-horizontal:absolute;mso-position-horizontal-relative:char;mso-position-vertical:absolute;mso-position-vertical-relative:line;mso-left-percent:-10001;mso-top-percent:-10001;v-text-anchor:top" o:gfxdata="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" fillcolor="#f7f7f7" strokeweight=".5pt">
+              <v:shape id="_x0000_s1037" type="#_x0000_t202" style="width:507pt;height:24.15pt;visibility:visible;mso-wrap-style:square;mso-left-percent:-10001;mso-top-percent:-10001;mso-position-horizontal:absolute;mso-position-horizontal-relative:char;mso-position-vertical:absolute;mso-position-vertical-relative:line;mso-left-percent:-10001;mso-top-percent:-10001;v-text-anchor:top" o:gfxdata="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" fillcolor="#f7f7f7" strokeweight=".5pt">
                 <v:shadow on="t" color="black" opacity="26214f" origin="-.5,-.5" offset=".74836mm,.74836mm"/>
                 <v:textbox style="mso-fit-shape-to-text:t">
                   <w:txbxContent>
@@ -9180,7 +9160,7 @@
                         <w:rPr>
                           <w:rFonts w:ascii="Consolas" w:hAnsi="Consolas" w:cs="Consolas"/>
                           <w:noProof/>
-                          <w:color w:val="E36C0A" w:themeColor="accent6" w:themeShade="BF"/>
+                          <w:color w:val="00B050"/>
                           <w:sz w:val="20"/>
                           <w:szCs w:val="20"/>
                         </w:rPr>
@@ -9190,7 +9170,7 @@
                         <w:rPr>
                           <w:rFonts w:ascii="Consolas" w:hAnsi="Consolas" w:cs="Consolas"/>
                           <w:noProof/>
-                          <w:color w:val="E36C0A" w:themeColor="accent6" w:themeShade="BF"/>
+                          <w:color w:val="00B050"/>
                           <w:sz w:val="20"/>
                           <w:szCs w:val="20"/>
                         </w:rPr>
@@ -9200,7 +9180,7 @@
                         <w:rPr>
                           <w:rFonts w:ascii="Consolas" w:hAnsi="Consolas" w:cs="Consolas"/>
                           <w:noProof/>
-                          <w:color w:val="E36C0A" w:themeColor="accent6" w:themeShade="BF"/>
+                          <w:color w:val="00B050"/>
                           <w:sz w:val="20"/>
                           <w:szCs w:val="20"/>
                         </w:rPr>
@@ -9279,37 +9259,17 @@
                         <w:rPr>
                           <w:rFonts w:ascii="Consolas" w:hAnsi="Consolas" w:cs="Consolas"/>
                           <w:noProof/>
-                          <w:color w:val="E36C0A" w:themeColor="accent6" w:themeShade="BF"/>
-                          <w:sz w:val="20"/>
-                          <w:szCs w:val="20"/>
-                        </w:rPr>
-                        <w:t xml:space="preserve"># </w:t>
-                      </w:r>
-                      <w:r>
-                        <w:rPr>
-                          <w:rFonts w:ascii="Consolas" w:hAnsi="Consolas" w:cs="Consolas"/>
-                          <w:noProof/>
-                          <w:color w:val="E36C0A" w:themeColor="accent6" w:themeShade="BF"/>
-                          <w:sz w:val="20"/>
-                          <w:szCs w:val="20"/>
-                        </w:rPr>
-                        <w:t>Ephemeral</w:t>
-                      </w:r>
-                      <w:r>
-                        <w:rPr>
-                          <w:rFonts w:ascii="Consolas" w:hAnsi="Consolas" w:cs="Consolas"/>
-                          <w:noProof/>
-                          <w:color w:val="E36C0A" w:themeColor="accent6" w:themeShade="BF"/>
-                          <w:sz w:val="20"/>
-                          <w:szCs w:val="20"/>
-                        </w:rPr>
-                        <w:t xml:space="preserve"> </w:t>
-                      </w:r>
-                      <w:r>
-                        <w:rPr>
-                          <w:rFonts w:ascii="Consolas" w:hAnsi="Consolas" w:cs="Consolas"/>
-                          <w:noProof/>
-                          <w:color w:val="E36C0A" w:themeColor="accent6" w:themeShade="BF"/>
+                          <w:color w:val="00B050"/>
+                          <w:sz w:val="20"/>
+                          <w:szCs w:val="20"/>
+                        </w:rPr>
+                        <w:t xml:space="preserve"># Ephemeral </w:t>
+                      </w:r>
+                      <w:r>
+                        <w:rPr>
+                          <w:rFonts w:ascii="Consolas" w:hAnsi="Consolas" w:cs="Consolas"/>
+                          <w:noProof/>
+                          <w:color w:val="00B050"/>
                           <w:sz w:val="20"/>
                           <w:szCs w:val="20"/>
                         </w:rPr>
@@ -9319,7 +9279,7 @@
                         <w:rPr>
                           <w:rFonts w:ascii="Consolas" w:hAnsi="Consolas" w:cs="Consolas"/>
                           <w:noProof/>
-                          <w:color w:val="E36C0A" w:themeColor="accent6" w:themeShade="BF"/>
+                          <w:color w:val="00B050"/>
                           <w:sz w:val="20"/>
                           <w:szCs w:val="20"/>
                         </w:rPr>
@@ -12630,7 +12590,7 @@
 </file>
 
 <file path=word/endnotes.xml><?xml version="1.0" encoding="utf-8"?>
-<w:endnotes xmlns:wpc="http://schemas.microsoft.com/office/word/2010/wordprocessingCanvas" xmlns:cx="http://schemas.microsoft.com/office/drawing/2014/chartex" xmlns:cx1="http://schemas.microsoft.com/office/drawing/2015/9/8/chartex" xmlns:cx2="http://schemas.microsoft.com/office/drawing/2015/10/21/chartex" xmlns:cx3="http://schemas.microsoft.com/office/drawing/2016/5/9/chartex" xmlns:cx4="http://schemas.microsoft.com/office/drawing/2016/5/10/chartex" xmlns:cx5="http://schemas.microsoft.com/office/drawing/2016/5/11/chartex" xmlns:cx6="http://schemas.microsoft.com/office/drawing/2016/5/12/chartex" xmlns:cx7="http://schemas.microsoft.com/office/drawing/2016/5/13/chartex" xmlns:cx8="http://schemas.microsoft.com/office/drawing/2016/5/14/chartex" xmlns:mc="http://schemas.openxmlformats.org/markup-compatibility/2006" xmlns:aink="http://schemas.microsoft.com/office/drawing/2016/ink" xmlns:am3d="http://schemas.microsoft.com/office/drawing/2017/model3d" xmlns:o="urn:schemas-microsoft-com:office:office" xmlns:oel="http://schemas.microsoft.com/office/2019/extlst" xmlns:r="http://schemas.openxmlformats.org/officeDocument/2006/relationships" xmlns:m="http://schemas.openxmlformats.org/officeDocument/2006/math" xmlns:v="urn:schemas-microsoft-com:vml" xmlns:wp14="http://schemas.microsoft.com/office/word/2010/wordprocessingDrawing" xmlns:wp="http://schemas.openxmlformats.org/drawingml/2006/wordprocessingDrawing" xmlns:w10="urn:schemas-microsoft-com:office:word" xmlns:w="http://schemas.openxmlformats.org/wordprocessingml/2006/main" xmlns:w14="http://schemas.microsoft.com/office/word/2010/wordml" xmlns:w15="http://schemas.microsoft.com/office/word/2012/wordml" xmlns:w16cex="http://schemas.microsoft.com/office/word/2018/wordml/cex" xmlns:w16cid="http://schemas.microsoft.com/office/word/2016/wordml/cid" xmlns:w16="http://schemas.microsoft.com/office/word/2018/wordml" xmlns:w16du="http://schemas.microsoft.com/office/word/2023/wordml/word16du" xmlns:w16sdtdh="http://schemas.microsoft.com/office/word/2020/wordml/sdtdatahash" xmlns:w16sdtfl="http://schemas.microsoft.com/office/word/2024/wordml/sdtformatlock" xmlns:w16se="http://schemas.microsoft.com/office/word/2015/wordml/symex" xmlns:wpg="http://schemas.microsoft.com/office/word/2010/wordprocessingGroup" xmlns:wpi="http://schemas.microsoft.com/office/word/2010/wordprocessingInk" xmlns:wne="http://schemas.microsoft.com/office/word/2006/wordml" xmlns:wps="http://schemas.microsoft.com/office/word/2010/wordprocessingShape" mc:Ignorable="w14 w15 w16se w16cid w16 w16cex w16sdtdh w16sdtfl w16du wp14">
+<w:endnotes xmlns:wpc="http://schemas.microsoft.com/office/word/2010/wordprocessingCanvas" xmlns:cx="http://schemas.microsoft.com/office/drawing/2014/chartex" xmlns:cx1="http://schemas.microsoft.com/office/drawing/2015/9/8/chartex" xmlns:cx2="http://schemas.microsoft.com/office/drawing/2015/10/21/chartex" xmlns:cx3="http://schemas.microsoft.com/office/drawing/2016/5/9/chartex" xmlns:cx4="http://schemas.microsoft.com/office/drawing/2016/5/10/chartex" xmlns:cx5="http://schemas.microsoft.com/office/drawing/2016/5/11/chartex" xmlns:cx6="http://schemas.microsoft.com/office/drawing/2016/5/12/chartex" xmlns:cx7="http://schemas.microsoft.com/office/drawing/2016/5/13/chartex" xmlns:cx8="http://schemas.microsoft.com/office/drawing/2016/5/14/chartex" xmlns:mc="http://schemas.openxmlformats.org/markup-compatibility/2006" xmlns:m="http://schemas.openxmlformats.org/officeDocument/2006/math" xmlns:aink="http://schemas.microsoft.com/office/drawing/2016/ink" xmlns:am3d="http://schemas.microsoft.com/office/drawing/2017/model3d" xmlns:oel="http://schemas.microsoft.com/office/2019/extlst" xmlns:r="http://schemas.openxmlformats.org/officeDocument/2006/relationships" xmlns:wp14="http://schemas.microsoft.com/office/word/2010/wordprocessingDrawing" xmlns:wp="http://schemas.openxmlformats.org/drawingml/2006/wordprocessingDrawing" xmlns:wpg="http://schemas.microsoft.com/office/word/2010/wordprocessingGroup" xmlns:wpi="http://schemas.microsoft.com/office/word/2010/wordprocessingInk" xmlns:wps="http://schemas.microsoft.com/office/word/2010/wordprocessingShape" xmlns:o="urn:schemas-microsoft-com:office:office" xmlns:v="urn:schemas-microsoft-com:vml" xmlns:w10="urn:schemas-microsoft-com:office:word" xmlns:w="http://schemas.openxmlformats.org/wordprocessingml/2006/main" xmlns:w14="http://schemas.microsoft.com/office/word/2010/wordml" xmlns:w15="http://schemas.microsoft.com/office/word/2012/wordml" xmlns:w16cex="http://schemas.microsoft.com/office/word/2018/wordml/cex" xmlns:w16cid="http://schemas.microsoft.com/office/word/2016/wordml/cid" xmlns:w16="http://schemas.microsoft.com/office/word/2018/wordml" xmlns:w16sdtdh="http://schemas.microsoft.com/office/word/2020/wordml/sdtdatahash" xmlns:w16sdtfl="http://schemas.microsoft.com/office/word/2024/wordml/sdtformatlock" xmlns:w16se="http://schemas.microsoft.com/office/word/2015/wordml/symex" xmlns:w16du="http://schemas.microsoft.com/office/word/2023/wordml/word16du" xmlns:wne="http://schemas.microsoft.com/office/word/2006/wordml" mc:Ignorable="w14 w15 w16se w16cid w16 w16cex w16sdtdh w16sdtfl w16du wp14">
   <w:endnote w:type="separator" w:id="-1">
     <w:p>
       <w:pPr>
@@ -12655,7 +12615,7 @@
 </file>
 
 <file path=word/footer1.xml><?xml version="1.0" encoding="utf-8"?>
-<w:ftr xmlns:wpc="http://schemas.microsoft.com/office/word/2010/wordprocessingCanvas" xmlns:cx="http://schemas.microsoft.com/office/drawing/2014/chartex" xmlns:cx1="http://schemas.microsoft.com/office/drawing/2015/9/8/chartex" xmlns:cx2="http://schemas.microsoft.com/office/drawing/2015/10/21/chartex" xmlns:cx3="http://schemas.microsoft.com/office/drawing/2016/5/9/chartex" xmlns:cx4="http://schemas.microsoft.com/office/drawing/2016/5/10/chartex" xmlns:cx5="http://schemas.microsoft.com/office/drawing/2016/5/11/chartex" xmlns:cx6="http://schemas.microsoft.com/office/drawing/2016/5/12/chartex" xmlns:cx7="http://schemas.microsoft.com/office/drawing/2016/5/13/chartex" xmlns:cx8="http://schemas.microsoft.com/office/drawing/2016/5/14/chartex" xmlns:mc="http://schemas.openxmlformats.org/markup-compatibility/2006" xmlns:aink="http://schemas.microsoft.com/office/drawing/2016/ink" xmlns:am3d="http://schemas.microsoft.com/office/drawing/2017/model3d" xmlns:o="urn:schemas-microsoft-com:office:office" xmlns:oel="http://schemas.microsoft.com/office/2019/extlst" xmlns:r="http://schemas.openxmlformats.org/officeDocument/2006/relationships" xmlns:m="http://schemas.openxmlformats.org/officeDocument/2006/math" xmlns:v="urn:schemas-microsoft-com:vml" xmlns:wp14="http://schemas.microsoft.com/office/word/2010/wordprocessingDrawing" xmlns:wp="http://schemas.openxmlformats.org/drawingml/2006/wordprocessingDrawing" xmlns:w10="urn:schemas-microsoft-com:office:word" xmlns:w="http://schemas.openxmlformats.org/wordprocessingml/2006/main" xmlns:w14="http://schemas.microsoft.com/office/word/2010/wordml" xmlns:w15="http://schemas.microsoft.com/office/word/2012/wordml" xmlns:w16cex="http://schemas.microsoft.com/office/word/2018/wordml/cex" xmlns:w16cid="http://schemas.microsoft.com/office/word/2016/wordml/cid" xmlns:w16="http://schemas.microsoft.com/office/word/2018/wordml" xmlns:w16du="http://schemas.microsoft.com/office/word/2023/wordml/word16du" xmlns:w16sdtdh="http://schemas.microsoft.com/office/word/2020/wordml/sdtdatahash" xmlns:w16sdtfl="http://schemas.microsoft.com/office/word/2024/wordml/sdtformatlock" xmlns:w16se="http://schemas.microsoft.com/office/word/2015/wordml/symex" xmlns:wpg="http://schemas.microsoft.com/office/word/2010/wordprocessingGroup" xmlns:wpi="http://schemas.microsoft.com/office/word/2010/wordprocessingInk" xmlns:wne="http://schemas.microsoft.com/office/word/2006/wordml" xmlns:wps="http://schemas.microsoft.com/office/word/2010/wordprocessingShape" mc:Ignorable="w14 w15 w16se w16cid w16 w16cex w16sdtdh w16sdtfl w16du wp14">
+<w:ftr xmlns:wpc="http://schemas.microsoft.com/office/word/2010/wordprocessingCanvas" xmlns:cx="http://schemas.microsoft.com/office/drawing/2014/chartex" xmlns:cx1="http://schemas.microsoft.com/office/drawing/2015/9/8/chartex" xmlns:cx2="http://schemas.microsoft.com/office/drawing/2015/10/21/chartex" xmlns:cx3="http://schemas.microsoft.com/office/drawing/2016/5/9/chartex" xmlns:cx4="http://schemas.microsoft.com/office/drawing/2016/5/10/chartex" xmlns:cx5="http://schemas.microsoft.com/office/drawing/2016/5/11/chartex" xmlns:cx6="http://schemas.microsoft.com/office/drawing/2016/5/12/chartex" xmlns:cx7="http://schemas.microsoft.com/office/drawing/2016/5/13/chartex" xmlns:cx8="http://schemas.microsoft.com/office/drawing/2016/5/14/chartex" xmlns:mc="http://schemas.openxmlformats.org/markup-compatibility/2006" xmlns:m="http://schemas.openxmlformats.org/officeDocument/2006/math" xmlns:aink="http://schemas.microsoft.com/office/drawing/2016/ink" xmlns:am3d="http://schemas.microsoft.com/office/drawing/2017/model3d" xmlns:oel="http://schemas.microsoft.com/office/2019/extlst" xmlns:r="http://schemas.openxmlformats.org/officeDocument/2006/relationships" xmlns:wp14="http://schemas.microsoft.com/office/word/2010/wordprocessingDrawing" xmlns:wp="http://schemas.openxmlformats.org/drawingml/2006/wordprocessingDrawing" xmlns:wpg="http://schemas.microsoft.com/office/word/2010/wordprocessingGroup" xmlns:wpi="http://schemas.microsoft.com/office/word/2010/wordprocessingInk" xmlns:wps="http://schemas.microsoft.com/office/word/2010/wordprocessingShape" xmlns:o="urn:schemas-microsoft-com:office:office" xmlns:v="urn:schemas-microsoft-com:vml" xmlns:w10="urn:schemas-microsoft-com:office:word" xmlns:w="http://schemas.openxmlformats.org/wordprocessingml/2006/main" xmlns:w14="http://schemas.microsoft.com/office/word/2010/wordml" xmlns:w15="http://schemas.microsoft.com/office/word/2012/wordml" xmlns:w16cex="http://schemas.microsoft.com/office/word/2018/wordml/cex" xmlns:w16cid="http://schemas.microsoft.com/office/word/2016/wordml/cid" xmlns:w16="http://schemas.microsoft.com/office/word/2018/wordml" xmlns:w16sdtdh="http://schemas.microsoft.com/office/word/2020/wordml/sdtdatahash" xmlns:w16sdtfl="http://schemas.microsoft.com/office/word/2024/wordml/sdtformatlock" xmlns:w16se="http://schemas.microsoft.com/office/word/2015/wordml/symex" xmlns:w16du="http://schemas.microsoft.com/office/word/2023/wordml/word16du" xmlns:wne="http://schemas.microsoft.com/office/word/2006/wordml" mc:Ignorable="w14 w15 w16se w16cid w16 w16cex w16sdtdh w16sdtfl w16du wp14">
   <w:p>
     <w:pPr>
       <w:pStyle w:val="Footer"/>
@@ -12861,7 +12821,7 @@
 </file>
 
 <file path=word/footnotes.xml><?xml version="1.0" encoding="utf-8"?>
-<w:footnotes xmlns:wpc="http://schemas.microsoft.com/office/word/2010/wordprocessingCanvas" xmlns:cx="http://schemas.microsoft.com/office/drawing/2014/chartex" xmlns:cx1="http://schemas.microsoft.com/office/drawing/2015/9/8/chartex" xmlns:cx2="http://schemas.microsoft.com/office/drawing/2015/10/21/chartex" xmlns:cx3="http://schemas.microsoft.com/office/drawing/2016/5/9/chartex" xmlns:cx4="http://schemas.microsoft.com/office/drawing/2016/5/10/chartex" xmlns:cx5="http://schemas.microsoft.com/office/drawing/2016/5/11/chartex" xmlns:cx6="http://schemas.microsoft.com/office/drawing/2016/5/12/chartex" xmlns:cx7="http://schemas.microsoft.com/office/drawing/2016/5/13/chartex" xmlns:cx8="http://schemas.microsoft.com/office/drawing/2016/5/14/chartex" xmlns:mc="http://schemas.openxmlformats.org/markup-compatibility/2006" xmlns:aink="http://schemas.microsoft.com/office/drawing/2016/ink" xmlns:am3d="http://schemas.microsoft.com/office/drawing/2017/model3d" xmlns:o="urn:schemas-microsoft-com:office:office" xmlns:oel="http://schemas.microsoft.com/office/2019/extlst" xmlns:r="http://schemas.openxmlformats.org/officeDocument/2006/relationships" xmlns:m="http://schemas.openxmlformats.org/officeDocument/2006/math" xmlns:v="urn:schemas-microsoft-com:vml" xmlns:wp14="http://schemas.microsoft.com/office/word/2010/wordprocessingDrawing" xmlns:wp="http://schemas.openxmlformats.org/drawingml/2006/wordprocessingDrawing" xmlns:w10="urn:schemas-microsoft-com:office:word" xmlns:w="http://schemas.openxmlformats.org/wordprocessingml/2006/main" xmlns:w14="http://schemas.microsoft.com/office/word/2010/wordml" xmlns:w15="http://schemas.microsoft.com/office/word/2012/wordml" xmlns:w16cex="http://schemas.microsoft.com/office/word/2018/wordml/cex" xmlns:w16cid="http://schemas.microsoft.com/office/word/2016/wordml/cid" xmlns:w16="http://schemas.microsoft.com/office/word/2018/wordml" xmlns:w16du="http://schemas.microsoft.com/office/word/2023/wordml/word16du" xmlns:w16sdtdh="http://schemas.microsoft.com/office/word/2020/wordml/sdtdatahash" xmlns:w16sdtfl="http://schemas.microsoft.com/office/word/2024/wordml/sdtformatlock" xmlns:w16se="http://schemas.microsoft.com/office/word/2015/wordml/symex" xmlns:wpg="http://schemas.microsoft.com/office/word/2010/wordprocessingGroup" xmlns:wpi="http://schemas.microsoft.com/office/word/2010/wordprocessingInk" xmlns:wne="http://schemas.microsoft.com/office/word/2006/wordml" xmlns:wps="http://schemas.microsoft.com/office/word/2010/wordprocessingShape" mc:Ignorable="w14 w15 w16se w16cid w16 w16cex w16sdtdh w16sdtfl w16du wp14">
+<w:footnotes xmlns:wpc="http://schemas.microsoft.com/office/word/2010/wordprocessingCanvas" xmlns:cx="http://schemas.microsoft.com/office/drawing/2014/chartex" xmlns:cx1="http://schemas.microsoft.com/office/drawing/2015/9/8/chartex" xmlns:cx2="http://schemas.microsoft.com/office/drawing/2015/10/21/chartex" xmlns:cx3="http://schemas.microsoft.com/office/drawing/2016/5/9/chartex" xmlns:cx4="http://schemas.microsoft.com/office/drawing/2016/5/10/chartex" xmlns:cx5="http://schemas.microsoft.com/office/drawing/2016/5/11/chartex" xmlns:cx6="http://schemas.microsoft.com/office/drawing/2016/5/12/chartex" xmlns:cx7="http://schemas.microsoft.com/office/drawing/2016/5/13/chartex" xmlns:cx8="http://schemas.microsoft.com/office/drawing/2016/5/14/chartex" xmlns:mc="http://schemas.openxmlformats.org/markup-compatibility/2006" xmlns:m="http://schemas.openxmlformats.org/officeDocument/2006/math" xmlns:aink="http://schemas.microsoft.com/office/drawing/2016/ink" xmlns:am3d="http://schemas.microsoft.com/office/drawing/2017/model3d" xmlns:oel="http://schemas.microsoft.com/office/2019/extlst" xmlns:r="http://schemas.openxmlformats.org/officeDocument/2006/relationships" xmlns:wp14="http://schemas.microsoft.com/office/word/2010/wordprocessingDrawing" xmlns:wp="http://schemas.openxmlformats.org/drawingml/2006/wordprocessingDrawing" xmlns:wpg="http://schemas.microsoft.com/office/word/2010/wordprocessingGroup" xmlns:wpi="http://schemas.microsoft.com/office/word/2010/wordprocessingInk" xmlns:wps="http://schemas.microsoft.com/office/word/2010/wordprocessingShape" xmlns:o="urn:schemas-microsoft-com:office:office" xmlns:v="urn:schemas-microsoft-com:vml" xmlns:w10="urn:schemas-microsoft-com:office:word" xmlns:w="http://schemas.openxmlformats.org/wordprocessingml/2006/main" xmlns:w14="http://schemas.microsoft.com/office/word/2010/wordml" xmlns:w15="http://schemas.microsoft.com/office/word/2012/wordml" xmlns:w16cex="http://schemas.microsoft.com/office/word/2018/wordml/cex" xmlns:w16cid="http://schemas.microsoft.com/office/word/2016/wordml/cid" xmlns:w16="http://schemas.microsoft.com/office/word/2018/wordml" xmlns:w16sdtdh="http://schemas.microsoft.com/office/word/2020/wordml/sdtdatahash" xmlns:w16sdtfl="http://schemas.microsoft.com/office/word/2024/wordml/sdtformatlock" xmlns:w16se="http://schemas.microsoft.com/office/word/2015/wordml/symex" xmlns:w16du="http://schemas.microsoft.com/office/word/2023/wordml/word16du" xmlns:wne="http://schemas.microsoft.com/office/word/2006/wordml" mc:Ignorable="w14 w15 w16se w16cid w16 w16cex w16sdtdh w16sdtfl w16du wp14">
   <w:footnote w:type="separator" w:id="-1">
     <w:p>
       <w:pPr>
@@ -12886,7 +12846,7 @@
 </file>
 
 <file path=word/numbering.xml><?xml version="1.0" encoding="utf-8"?>
-<w:numbering xmlns:wpc="http://schemas.microsoft.com/office/word/2010/wordprocessingCanvas" xmlns:cx="http://schemas.microsoft.com/office/drawing/2014/chartex" xmlns:cx1="http://schemas.microsoft.com/office/drawing/2015/9/8/chartex" xmlns:cx2="http://schemas.microsoft.com/office/drawing/2015/10/21/chartex" xmlns:cx3="http://schemas.microsoft.com/office/drawing/2016/5/9/chartex" xmlns:cx4="http://schemas.microsoft.com/office/drawing/2016/5/10/chartex" xmlns:cx5="http://schemas.microsoft.com/office/drawing/2016/5/11/chartex" xmlns:cx6="http://schemas.microsoft.com/office/drawing/2016/5/12/chartex" xmlns:cx7="http://schemas.microsoft.com/office/drawing/2016/5/13/chartex" xmlns:cx8="http://schemas.microsoft.com/office/drawing/2016/5/14/chartex" xmlns:mc="http://schemas.openxmlformats.org/markup-compatibility/2006" xmlns:aink="http://schemas.microsoft.com/office/drawing/2016/ink" xmlns:am3d="http://schemas.microsoft.com/office/drawing/2017/model3d" xmlns:o="urn:schemas-microsoft-com:office:office" xmlns:oel="http://schemas.microsoft.com/office/2019/extlst" xmlns:r="http://schemas.openxmlformats.org/officeDocument/2006/relationships" xmlns:m="http://schemas.openxmlformats.org/officeDocument/2006/math" xmlns:v="urn:schemas-microsoft-com:vml" xmlns:wp14="http://schemas.microsoft.com/office/word/2010/wordprocessingDrawing" xmlns:wp="http://schemas.openxmlformats.org/drawingml/2006/wordprocessingDrawing" xmlns:w10="urn:schemas-microsoft-com:office:word" xmlns:w="http://schemas.openxmlformats.org/wordprocessingml/2006/main" xmlns:w14="http://schemas.microsoft.com/office/word/2010/wordml" xmlns:w15="http://schemas.microsoft.com/office/word/2012/wordml" xmlns:w16cex="http://schemas.microsoft.com/office/word/2018/wordml/cex" xmlns:w16cid="http://schemas.microsoft.com/office/word/2016/wordml/cid" xmlns:w16="http://schemas.microsoft.com/office/word/2018/wordml" xmlns:w16du="http://schemas.microsoft.com/office/word/2023/wordml/word16du" xmlns:w16sdtdh="http://schemas.microsoft.com/office/word/2020/wordml/sdtdatahash" xmlns:w16sdtfl="http://schemas.microsoft.com/office/word/2024/wordml/sdtformatlock" xmlns:w16se="http://schemas.microsoft.com/office/word/2015/wordml/symex" xmlns:wpg="http://schemas.microsoft.com/office/word/2010/wordprocessingGroup" xmlns:wpi="http://schemas.microsoft.com/office/word/2010/wordprocessingInk" xmlns:wne="http://schemas.microsoft.com/office/word/2006/wordml" xmlns:wps="http://schemas.microsoft.com/office/word/2010/wordprocessingShape" mc:Ignorable="w14 w15 w16se w16cid w16 w16cex w16sdtdh w16sdtfl w16du wp14">
+<w:numbering xmlns:wpc="http://schemas.microsoft.com/office/word/2010/wordprocessingCanvas" xmlns:cx="http://schemas.microsoft.com/office/drawing/2014/chartex" xmlns:cx1="http://schemas.microsoft.com/office/drawing/2015/9/8/chartex" xmlns:cx2="http://schemas.microsoft.com/office/drawing/2015/10/21/chartex" xmlns:cx3="http://schemas.microsoft.com/office/drawing/2016/5/9/chartex" xmlns:cx4="http://schemas.microsoft.com/office/drawing/2016/5/10/chartex" xmlns:cx5="http://schemas.microsoft.com/office/drawing/2016/5/11/chartex" xmlns:cx6="http://schemas.microsoft.com/office/drawing/2016/5/12/chartex" xmlns:cx7="http://schemas.microsoft.com/office/drawing/2016/5/13/chartex" xmlns:cx8="http://schemas.microsoft.com/office/drawing/2016/5/14/chartex" xmlns:mc="http://schemas.openxmlformats.org/markup-compatibility/2006" xmlns:m="http://schemas.openxmlformats.org/officeDocument/2006/math" xmlns:aink="http://schemas.microsoft.com/office/drawing/2016/ink" xmlns:am3d="http://schemas.microsoft.com/office/drawing/2017/model3d" xmlns:oel="http://schemas.microsoft.com/office/2019/extlst" xmlns:r="http://schemas.openxmlformats.org/officeDocument/2006/relationships" xmlns:wp14="http://schemas.microsoft.com/office/word/2010/wordprocessingDrawing" xmlns:wp="http://schemas.openxmlformats.org/drawingml/2006/wordprocessingDrawing" xmlns:wpg="http://schemas.microsoft.com/office/word/2010/wordprocessingGroup" xmlns:wpi="http://schemas.microsoft.com/office/word/2010/wordprocessingInk" xmlns:wps="http://schemas.microsoft.com/office/word/2010/wordprocessingShape" xmlns:o="urn:schemas-microsoft-com:office:office" xmlns:v="urn:schemas-microsoft-com:vml" xmlns:w10="urn:schemas-microsoft-com:office:word" xmlns:w="http://schemas.openxmlformats.org/wordprocessingml/2006/main" xmlns:w14="http://schemas.microsoft.com/office/word/2010/wordml" xmlns:w15="http://schemas.microsoft.com/office/word/2012/wordml" xmlns:w16cex="http://schemas.microsoft.com/office/word/2018/wordml/cex" xmlns:w16cid="http://schemas.microsoft.com/office/word/2016/wordml/cid" xmlns:w16="http://schemas.microsoft.com/office/word/2018/wordml" xmlns:w16sdtdh="http://schemas.microsoft.com/office/word/2020/wordml/sdtdatahash" xmlns:w16sdtfl="http://schemas.microsoft.com/office/word/2024/wordml/sdtformatlock" xmlns:w16se="http://schemas.microsoft.com/office/word/2015/wordml/symex" xmlns:w16du="http://schemas.microsoft.com/office/word/2023/wordml/word16du" xmlns:wne="http://schemas.microsoft.com/office/word/2006/wordml" mc:Ignorable="w14 w15 w16se w16cid w16 w16cex w16sdtdh w16sdtfl w16du wp14">
   <w:abstractNum w:abstractNumId="0" w15:restartNumberingAfterBreak="0">
     <w:nsid w:val="00FD1C8D"/>
     <w:multiLevelType w:val="hybridMultilevel"/>
@@ -14923,7 +14883,7 @@
 </file>
 
 <file path=word/styles.xml><?xml version="1.0" encoding="utf-8"?>
-<w:styles xmlns:mc="http://schemas.openxmlformats.org/markup-compatibility/2006" xmlns:r="http://schemas.openxmlformats.org/officeDocument/2006/relationships" xmlns:w="http://schemas.openxmlformats.org/wordprocessingml/2006/main" xmlns:w14="http://schemas.microsoft.com/office/word/2010/wordml" xmlns:w15="http://schemas.microsoft.com/office/word/2012/wordml" xmlns:w16cex="http://schemas.microsoft.com/office/word/2018/wordml/cex" xmlns:w16cid="http://schemas.microsoft.com/office/word/2016/wordml/cid" xmlns:w16="http://schemas.microsoft.com/office/word/2018/wordml" xmlns:w16du="http://schemas.microsoft.com/office/word/2023/wordml/word16du" xmlns:w16sdtdh="http://schemas.microsoft.com/office/word/2020/wordml/sdtdatahash" xmlns:w16sdtfl="http://schemas.microsoft.com/office/word/2024/wordml/sdtformatlock" xmlns:w16se="http://schemas.microsoft.com/office/word/2015/wordml/symex" mc:Ignorable="w14 w15 w16se w16cid w16 w16cex w16sdtdh w16sdtfl w16du">
+<w:styles xmlns:mc="http://schemas.openxmlformats.org/markup-compatibility/2006" xmlns:r="http://schemas.openxmlformats.org/officeDocument/2006/relationships" xmlns:w="http://schemas.openxmlformats.org/wordprocessingml/2006/main" xmlns:w14="http://schemas.microsoft.com/office/word/2010/wordml" xmlns:w15="http://schemas.microsoft.com/office/word/2012/wordml" xmlns:w16cex="http://schemas.microsoft.com/office/word/2018/wordml/cex" xmlns:w16cid="http://schemas.microsoft.com/office/word/2016/wordml/cid" xmlns:w16="http://schemas.microsoft.com/office/word/2018/wordml" xmlns:w16sdtdh="http://schemas.microsoft.com/office/word/2020/wordml/sdtdatahash" xmlns:w16sdtfl="http://schemas.microsoft.com/office/word/2024/wordml/sdtformatlock" xmlns:w16se="http://schemas.microsoft.com/office/word/2015/wordml/symex" xmlns:w16du="http://schemas.microsoft.com/office/word/2023/wordml/word16du" mc:Ignorable="w14 w15 w16se w16cid w16 w16cex w16sdtdh w16sdtfl w16du">
   <w:docDefaults>
     <w:rPrDefault>
       <w:rPr>

</xml_diff>

<commit_message>
Removed non-used steps from the sequence diagram
</commit_message>
<xml_diff>
--- a/defensive-publications/partial-encryption-full-signature.docx
+++ b/defensive-publications/partial-encryption-full-signature.docx
@@ -26,7 +26,7 @@
         <mc:AlternateContent>
           <mc:Choice Requires="wps">
             <w:drawing>
-              <wp:anchor distT="0" distB="0" distL="114300" distR="114300" simplePos="0" relativeHeight="251658240" behindDoc="0" locked="0" layoutInCell="1" allowOverlap="1" wp14:anchorId="7ECF17C9" wp14:editId="69D06F6E">
+              <wp:anchor distT="0" distB="0" distL="114300" distR="114300" simplePos="0" relativeHeight="251657216" behindDoc="0" locked="0" layoutInCell="1" allowOverlap="1" wp14:anchorId="7ECF17C9" wp14:editId="44A601DD">
                 <wp:simplePos x="0" y="0"/>
                 <wp:positionH relativeFrom="column">
                   <wp:posOffset>6075825</wp:posOffset>
@@ -148,7 +148,7 @@
           </mc:Choice>
           <mc:Fallback>
             <w:pict>
-              <v:roundrect id="Text Box 1" o:spid="_x0000_s1026" style="position:absolute;left:0;text-align:left;margin-left:478.4pt;margin-top:-15.95pt;width:79.4pt;height:39.9pt;z-index:251658240;visibility:visible;mso-wrap-style:square;mso-width-percent:0;mso-height-percent:0;mso-wrap-distance-left:9pt;mso-wrap-distance-top:0;mso-wrap-distance-right:9pt;mso-wrap-distance-bottom:0;mso-position-horizontal:absolute;mso-position-horizontal-relative:text;mso-position-vertical:absolute;mso-position-vertical-relative:text;mso-width-percent:0;mso-height-percent:0;mso-width-relative:page;mso-height-relative:page;v-text-anchor:top" arcsize="6587f" o:gfxdata="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" fillcolor="#ffc">
+              <v:roundrect w14:anchorId="7ECF17C9" id="Text Box 1" o:spid="_x0000_s1026" style="position:absolute;left:0;text-align:left;margin-left:478.4pt;margin-top:-15.95pt;width:79.4pt;height:39.9pt;z-index:251657216;visibility:visible;mso-wrap-style:square;mso-width-percent:0;mso-height-percent:0;mso-wrap-distance-left:9pt;mso-wrap-distance-top:0;mso-wrap-distance-right:9pt;mso-wrap-distance-bottom:0;mso-position-horizontal:absolute;mso-position-horizontal-relative:text;mso-position-vertical:absolute;mso-position-vertical-relative:text;mso-width-percent:0;mso-height-percent:0;mso-width-relative:page;mso-height-relative:page;v-text-anchor:top" arcsize="6587f" o:gfxdata="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" fillcolor="#ffc">
                 <v:stroke joinstyle="miter"/>
                 <v:shadow opacity=".5" offset="6pt,6pt"/>
                 <v:textbox inset=",,0">
@@ -1045,6 +1045,7 @@
         <w:ind w:left="0"/>
         <w:rPr>
           <w:rFonts w:ascii="Arial" w:hAnsi="Arial" w:cs="Arial"/>
+          <w:iCs/>
           <w:sz w:val="20"/>
           <w:szCs w:val="20"/>
         </w:rPr>
@@ -1476,15 +1477,14 @@
       <w:r>
         <w:rPr>
           <w:rFonts w:ascii="Arial" w:hAnsi="Arial" w:cs="Arial"/>
-          <w:noProof/>
           <w:sz w:val="20"/>
           <w:szCs w:val="20"/>
         </w:rPr>
         <w:drawing>
-          <wp:inline distT="0" distB="0" distL="0" distR="0" wp14:anchorId="7C4FC113" wp14:editId="1AAEE83F">
-            <wp:extent cx="6402779" cy="4135556"/>
-            <wp:effectExtent l="38100" t="38100" r="86995" b="93980"/>
-            <wp:docPr id="1865902517" name="Picture 16"/>
+          <wp:inline distT="0" distB="0" distL="0" distR="0" wp14:anchorId="3DB894CD" wp14:editId="6578F7D3">
+            <wp:extent cx="6622677" cy="3966325"/>
+            <wp:effectExtent l="38100" t="38100" r="83185" b="85090"/>
+            <wp:docPr id="1856592206" name="Picture 1"/>
             <wp:cNvGraphicFramePr>
               <a:graphicFrameLocks xmlns:a="http://schemas.openxmlformats.org/drawingml/2006/main" noChangeAspect="1"/>
             </wp:cNvGraphicFramePr>
@@ -1492,17 +1492,11 @@
               <a:graphicData uri="http://schemas.openxmlformats.org/drawingml/2006/picture">
                 <pic:pic xmlns:pic="http://schemas.openxmlformats.org/drawingml/2006/picture">
                   <pic:nvPicPr>
-                    <pic:cNvPr id="1865902517" name="Picture 1865902517"/>
+                    <pic:cNvPr id="1856592206" name=""/>
                     <pic:cNvPicPr/>
                   </pic:nvPicPr>
                   <pic:blipFill>
-                    <a:blip r:embed="rId8" cstate="print">
-                      <a:extLst>
-                        <a:ext uri="{28A0092B-C50C-407E-A947-70E740481C1C}">
-                          <a14:useLocalDpi xmlns:a14="http://schemas.microsoft.com/office/drawing/2010/main" val="0"/>
-                        </a:ext>
-                      </a:extLst>
-                    </a:blip>
+                    <a:blip r:embed="rId8"/>
                     <a:stretch>
                       <a:fillRect/>
                     </a:stretch>
@@ -1510,7 +1504,7 @@
                   <pic:spPr>
                     <a:xfrm>
                       <a:off x="0" y="0"/>
-                      <a:ext cx="6427228" cy="4151348"/>
+                      <a:ext cx="6697098" cy="4010896"/>
                     </a:xfrm>
                     <a:prstGeom prst="rect">
                       <a:avLst/>
@@ -1534,6 +1528,19 @@
           </wp:inline>
         </w:drawing>
       </w:r>
+    </w:p>
+    <w:p>
+      <w:pPr>
+        <w:pStyle w:val="ListParagraph"/>
+        <w:spacing w:after="120"/>
+        <w:ind w:left="0"/>
+        <w:jc w:val="center"/>
+        <w:rPr>
+          <w:rFonts w:ascii="Arial" w:hAnsi="Arial" w:cs="Arial"/>
+          <w:sz w:val="20"/>
+          <w:szCs w:val="20"/>
+        </w:rPr>
+      </w:pPr>
     </w:p>
     <w:p>
       <w:pPr>
@@ -1879,7 +1886,7 @@
         <mc:AlternateContent>
           <mc:Choice Requires="wps">
             <w:drawing>
-              <wp:anchor distT="0" distB="0" distL="114300" distR="114300" simplePos="0" relativeHeight="251666432" behindDoc="0" locked="0" layoutInCell="1" allowOverlap="1" wp14:anchorId="43107368" wp14:editId="6928314C">
+              <wp:anchor distT="0" distB="0" distL="114300" distR="114300" simplePos="0" relativeHeight="251665408" behindDoc="0" locked="0" layoutInCell="1" allowOverlap="1" wp14:anchorId="43107368" wp14:editId="03494B8C">
                 <wp:simplePos x="0" y="0"/>
                 <wp:positionH relativeFrom="column">
                   <wp:posOffset>2787015</wp:posOffset>
@@ -1962,11 +1969,11 @@
           </mc:Choice>
           <mc:Fallback>
             <w:pict>
-              <v:shapetype id="_x0000_t202" coordsize="21600,21600" o:spt="202" path="m,l,21600r21600,l21600,xe">
+              <v:shapetype w14:anchorId="43107368" id="_x0000_t202" coordsize="21600,21600" o:spt="202" path="m,l,21600r21600,l21600,xe">
                 <v:stroke joinstyle="miter"/>
                 <v:path gradientshapeok="t" o:connecttype="rect"/>
               </v:shapetype>
-              <v:shape id="Text Box 21" o:spid="_x0000_s1027" type="#_x0000_t202" style="position:absolute;left:0;text-align:left;margin-left:219.45pt;margin-top:37.8pt;width:86.6pt;height:22.8pt;z-index:251666432;visibility:visible;mso-wrap-style:none;mso-width-percent:0;mso-height-percent:0;mso-wrap-distance-left:9pt;mso-wrap-distance-top:0;mso-wrap-distance-right:9pt;mso-wrap-distance-bottom:0;mso-position-horizontal:absolute;mso-position-horizontal-relative:text;mso-position-vertical:absolute;mso-position-vertical-relative:text;mso-width-percent:0;mso-height-percent:0;mso-width-relative:margin;mso-height-relative:margin;v-text-anchor:middle" o:gfxdata="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" fillcolor="#fbf8d8" strokeweight=".5pt">
+              <v:shape id="Text Box 21" o:spid="_x0000_s1027" type="#_x0000_t202" style="position:absolute;left:0;text-align:left;margin-left:219.45pt;margin-top:37.8pt;width:86.6pt;height:22.8pt;z-index:251665408;visibility:visible;mso-wrap-style:none;mso-width-percent:0;mso-height-percent:0;mso-wrap-distance-left:9pt;mso-wrap-distance-top:0;mso-wrap-distance-right:9pt;mso-wrap-distance-bottom:0;mso-position-horizontal:absolute;mso-position-horizontal-relative:text;mso-position-vertical:absolute;mso-position-vertical-relative:text;mso-width-percent:0;mso-height-percent:0;mso-width-relative:margin;mso-height-relative:margin;v-text-anchor:middle" o:gfxdata="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" fillcolor="#fbf8d8" strokeweight=".5pt">
                 <v:shadow on="t" color="black" opacity="26214f" origin="-.5,-.5" offset=".74836mm,.74836mm"/>
                 <v:textbox style="mso-fit-shape-to-text:t">
                   <w:txbxContent>
@@ -2005,7 +2012,7 @@
         <mc:AlternateContent>
           <mc:Choice Requires="wps">
             <w:drawing>
-              <wp:anchor distT="0" distB="0" distL="114300" distR="114300" simplePos="0" relativeHeight="251665408" behindDoc="0" locked="0" layoutInCell="1" allowOverlap="1" wp14:anchorId="45F82C9E" wp14:editId="5CD4747A">
+              <wp:anchor distT="0" distB="0" distL="114300" distR="114300" simplePos="0" relativeHeight="251664384" behindDoc="0" locked="0" layoutInCell="1" allowOverlap="1" wp14:anchorId="45F82C9E" wp14:editId="2FA25FFD">
                 <wp:simplePos x="0" y="0"/>
                 <wp:positionH relativeFrom="column">
                   <wp:posOffset>2505607</wp:posOffset>
@@ -2062,7 +2069,7 @@
           </mc:Choice>
           <mc:Fallback>
             <w:pict>
-              <v:shapetype w14:anchorId="670F41FE" id="_x0000_t88" coordsize="21600,21600" o:spt="88" adj="1800,10800" path="m,qx10800@0l10800@2qy21600@11,10800@3l10800@1qy,21600e" filled="f">
+              <v:shapetype w14:anchorId="0ED3F7F8" id="_x0000_t88" coordsize="21600,21600" o:spt="88" adj="1800,10800" path="m,qx10800@0l10800@2qy21600@11,10800@3l10800@1qy,21600e" filled="f">
                 <v:formulas>
                   <v:f eqn="val #0"/>
                   <v:f eqn="sum 21600 0 #0"/>
@@ -2083,7 +2090,7 @@
                   <v:h position="bottomRight,#1" yrange="@9,@10"/>
                 </v:handles>
               </v:shapetype>
-              <v:shape id="Right Brace 20" o:spid="_x0000_s1026" type="#_x0000_t88" style="position:absolute;margin-left:197.3pt;margin-top:15pt;width:16.35pt;height:65.55pt;z-index:251665408;visibility:visible;mso-wrap-style:square;mso-width-percent:0;mso-wrap-distance-left:9pt;mso-wrap-distance-top:0;mso-wrap-distance-right:9pt;mso-wrap-distance-bottom:0;mso-position-horizontal:absolute;mso-position-horizontal-relative:text;mso-position-vertical:absolute;mso-position-vertical-relative:text;mso-width-percent:0;mso-width-relative:margin;v-text-anchor:middle" o:gfxdata="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" adj="449" strokecolor="#4579b8 [3044]"/>
+              <v:shape id="Right Brace 20" o:spid="_x0000_s1026" type="#_x0000_t88" style="position:absolute;margin-left:197.3pt;margin-top:15pt;width:16.35pt;height:65.55pt;z-index:251664384;visibility:visible;mso-wrap-style:square;mso-width-percent:0;mso-wrap-distance-left:9pt;mso-wrap-distance-top:0;mso-wrap-distance-right:9pt;mso-wrap-distance-bottom:0;mso-position-horizontal:absolute;mso-position-horizontal-relative:text;mso-position-vertical:absolute;mso-position-vertical-relative:text;mso-width-percent:0;mso-width-relative:margin;v-text-anchor:middle" o:gfxdata="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" adj="449" strokecolor="#4579b8 [3044]"/>
             </w:pict>
           </mc:Fallback>
         </mc:AlternateContent>
@@ -3012,7 +3019,7 @@
         <mc:AlternateContent>
           <mc:Choice Requires="wps">
             <w:drawing>
-              <wp:anchor distT="0" distB="0" distL="114300" distR="114300" simplePos="0" relativeHeight="251668480" behindDoc="0" locked="0" layoutInCell="1" allowOverlap="1" wp14:anchorId="2C0030A6" wp14:editId="1E570941">
+              <wp:anchor distT="0" distB="0" distL="114300" distR="114300" simplePos="0" relativeHeight="251667456" behindDoc="0" locked="0" layoutInCell="1" allowOverlap="1" wp14:anchorId="2C0030A6" wp14:editId="2DE3FD25">
                 <wp:simplePos x="0" y="0"/>
                 <wp:positionH relativeFrom="column">
                   <wp:posOffset>2757805</wp:posOffset>
@@ -3069,7 +3076,7 @@
           </mc:Choice>
           <mc:Fallback>
             <w:pict>
-              <v:shape w14:anchorId="4BBE829C" id="Right Brace 20" o:spid="_x0000_s1026" type="#_x0000_t88" style="position:absolute;margin-left:217.15pt;margin-top:97.25pt;width:16.35pt;height:65.55pt;z-index:251668480;visibility:visible;mso-wrap-style:square;mso-width-percent:0;mso-wrap-distance-left:9pt;mso-wrap-distance-top:0;mso-wrap-distance-right:9pt;mso-wrap-distance-bottom:0;mso-position-horizontal:absolute;mso-position-horizontal-relative:text;mso-position-vertical:absolute;mso-position-vertical-relative:text;mso-width-percent:0;mso-width-relative:margin;v-text-anchor:middle" o:gfxdata="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" adj="449" strokecolor="#4579b8 [3044]"/>
+              <v:shape w14:anchorId="5366D26B" id="Right Brace 20" o:spid="_x0000_s1026" type="#_x0000_t88" style="position:absolute;margin-left:217.15pt;margin-top:97.25pt;width:16.35pt;height:65.55pt;z-index:251667456;visibility:visible;mso-wrap-style:square;mso-width-percent:0;mso-wrap-distance-left:9pt;mso-wrap-distance-top:0;mso-wrap-distance-right:9pt;mso-wrap-distance-bottom:0;mso-position-horizontal:absolute;mso-position-horizontal-relative:text;mso-position-vertical:absolute;mso-position-vertical-relative:text;mso-width-percent:0;mso-width-relative:margin;v-text-anchor:middle" o:gfxdata="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" adj="449" strokecolor="#4579b8 [3044]"/>
             </w:pict>
           </mc:Fallback>
         </mc:AlternateContent>
@@ -3084,7 +3091,7 @@
         <mc:AlternateContent>
           <mc:Choice Requires="wps">
             <w:drawing>
-              <wp:anchor distT="0" distB="0" distL="114300" distR="114300" simplePos="0" relativeHeight="251669504" behindDoc="0" locked="0" layoutInCell="1" allowOverlap="1" wp14:anchorId="123D5EED" wp14:editId="576F6D4F">
+              <wp:anchor distT="0" distB="0" distL="114300" distR="114300" simplePos="0" relativeHeight="251668480" behindDoc="0" locked="0" layoutInCell="1" allowOverlap="1" wp14:anchorId="123D5EED" wp14:editId="1E7352A2">
                 <wp:simplePos x="0" y="0"/>
                 <wp:positionH relativeFrom="column">
                   <wp:posOffset>3039745</wp:posOffset>
@@ -3167,7 +3174,7 @@
           </mc:Choice>
           <mc:Fallback>
             <w:pict>
-              <v:shape w14:anchorId="123D5EED" id="_x0000_s1029" type="#_x0000_t202" style="position:absolute;margin-left:239.35pt;margin-top:120.3pt;width:86.6pt;height:22.8pt;z-index:251669504;visibility:visible;mso-wrap-style:none;mso-width-percent:0;mso-height-percent:0;mso-wrap-distance-left:9pt;mso-wrap-distance-top:0;mso-wrap-distance-right:9pt;mso-wrap-distance-bottom:0;mso-position-horizontal:absolute;mso-position-horizontal-relative:text;mso-position-vertical:absolute;mso-position-vertical-relative:text;mso-width-percent:0;mso-height-percent:0;mso-width-relative:margin;mso-height-relative:margin;v-text-anchor:middle" o:gfxdata="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" fillcolor="#fbf8d8" strokeweight=".5pt">
+              <v:shape w14:anchorId="123D5EED" id="_x0000_s1029" type="#_x0000_t202" style="position:absolute;margin-left:239.35pt;margin-top:120.3pt;width:86.6pt;height:22.8pt;z-index:251668480;visibility:visible;mso-wrap-style:none;mso-width-percent:0;mso-height-percent:0;mso-wrap-distance-left:9pt;mso-wrap-distance-top:0;mso-wrap-distance-right:9pt;mso-wrap-distance-bottom:0;mso-position-horizontal:absolute;mso-position-horizontal-relative:text;mso-position-vertical:absolute;mso-position-vertical-relative:text;mso-width-percent:0;mso-height-percent:0;mso-width-relative:margin;mso-height-relative:margin;v-text-anchor:middle" o:gfxdata="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" fillcolor="#fbf8d8" strokeweight=".5pt">
                 <v:shadow on="t" color="black" opacity="26214f" origin="-.5,-.5" offset=".74836mm,.74836mm"/>
                 <v:textbox style="mso-fit-shape-to-text:t">
                   <w:txbxContent>
@@ -4231,7 +4238,7 @@
         <mc:AlternateContent>
           <mc:Choice Requires="wps">
             <w:drawing>
-              <wp:anchor distT="0" distB="0" distL="114300" distR="114300" simplePos="0" relativeHeight="251672576" behindDoc="0" locked="0" layoutInCell="1" allowOverlap="1" wp14:anchorId="123D5EED" wp14:editId="576F6D4F">
+              <wp:anchor distT="0" distB="0" distL="114300" distR="114300" simplePos="0" relativeHeight="251671552" behindDoc="0" locked="0" layoutInCell="1" allowOverlap="1" wp14:anchorId="123D5EED" wp14:editId="2E46A15D">
                 <wp:simplePos x="0" y="0"/>
                 <wp:positionH relativeFrom="column">
                   <wp:posOffset>3034665</wp:posOffset>
@@ -4314,7 +4321,7 @@
           </mc:Choice>
           <mc:Fallback>
             <w:pict>
-              <v:shape w14:anchorId="123D5EED" id="_x0000_s1031" type="#_x0000_t202" style="position:absolute;margin-left:238.95pt;margin-top:138.3pt;width:86.6pt;height:22.8pt;z-index:251672576;visibility:visible;mso-wrap-style:none;mso-width-percent:0;mso-height-percent:0;mso-wrap-distance-left:9pt;mso-wrap-distance-top:0;mso-wrap-distance-right:9pt;mso-wrap-distance-bottom:0;mso-position-horizontal:absolute;mso-position-horizontal-relative:text;mso-position-vertical:absolute;mso-position-vertical-relative:text;mso-width-percent:0;mso-height-percent:0;mso-width-relative:margin;mso-height-relative:margin;v-text-anchor:middle" o:gfxdata="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" fillcolor="#fbf8d8" strokeweight=".5pt">
+              <v:shape w14:anchorId="123D5EED" id="_x0000_s1031" type="#_x0000_t202" style="position:absolute;margin-left:238.95pt;margin-top:138.3pt;width:86.6pt;height:22.8pt;z-index:251671552;visibility:visible;mso-wrap-style:none;mso-width-percent:0;mso-height-percent:0;mso-wrap-distance-left:9pt;mso-wrap-distance-top:0;mso-wrap-distance-right:9pt;mso-wrap-distance-bottom:0;mso-position-horizontal:absolute;mso-position-horizontal-relative:text;mso-position-vertical:absolute;mso-position-vertical-relative:text;mso-width-percent:0;mso-height-percent:0;mso-width-relative:margin;mso-height-relative:margin;v-text-anchor:middle" o:gfxdata="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" fillcolor="#fbf8d8" strokeweight=".5pt">
                 <v:shadow on="t" color="black" opacity="26214f" origin="-.5,-.5" offset=".74836mm,.74836mm"/>
                 <v:textbox style="mso-fit-shape-to-text:t">
                   <w:txbxContent>
@@ -4353,7 +4360,7 @@
         <mc:AlternateContent>
           <mc:Choice Requires="wps">
             <w:drawing>
-              <wp:anchor distT="0" distB="0" distL="114300" distR="114300" simplePos="0" relativeHeight="251671552" behindDoc="0" locked="0" layoutInCell="1" allowOverlap="1" wp14:anchorId="2C0030A6" wp14:editId="1E570941">
+              <wp:anchor distT="0" distB="0" distL="114300" distR="114300" simplePos="0" relativeHeight="251670528" behindDoc="0" locked="0" layoutInCell="1" allowOverlap="1" wp14:anchorId="2C0030A6" wp14:editId="4935C154">
                 <wp:simplePos x="0" y="0"/>
                 <wp:positionH relativeFrom="column">
                   <wp:posOffset>2752828</wp:posOffset>
@@ -4410,7 +4417,7 @@
           </mc:Choice>
           <mc:Fallback>
             <w:pict>
-              <v:shape w14:anchorId="0993BEF5" id="Right Brace 20" o:spid="_x0000_s1026" type="#_x0000_t88" style="position:absolute;margin-left:216.75pt;margin-top:115.25pt;width:16.35pt;height:65.55pt;z-index:251671552;visibility:visible;mso-wrap-style:square;mso-width-percent:0;mso-wrap-distance-left:9pt;mso-wrap-distance-top:0;mso-wrap-distance-right:9pt;mso-wrap-distance-bottom:0;mso-position-horizontal:absolute;mso-position-horizontal-relative:text;mso-position-vertical:absolute;mso-position-vertical-relative:text;mso-width-percent:0;mso-width-relative:margin;v-text-anchor:middle" o:gfxdata="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" adj="449" strokecolor="#4579b8 [3044]"/>
+              <v:shape w14:anchorId="1F9435B2" id="Right Brace 20" o:spid="_x0000_s1026" type="#_x0000_t88" style="position:absolute;margin-left:216.75pt;margin-top:115.25pt;width:16.35pt;height:65.55pt;z-index:251670528;visibility:visible;mso-wrap-style:square;mso-width-percent:0;mso-wrap-distance-left:9pt;mso-wrap-distance-top:0;mso-wrap-distance-right:9pt;mso-wrap-distance-bottom:0;mso-position-horizontal:absolute;mso-position-horizontal-relative:text;mso-position-vertical:absolute;mso-position-vertical-relative:text;mso-width-percent:0;mso-width-relative:margin;v-text-anchor:middle" o:gfxdata="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" adj="449" strokecolor="#4579b8 [3044]"/>
             </w:pict>
           </mc:Fallback>
         </mc:AlternateContent>
@@ -5994,7 +6001,7 @@
         <mc:AlternateContent>
           <mc:Choice Requires="wps">
             <w:drawing>
-              <wp:anchor distT="0" distB="0" distL="114300" distR="114300" simplePos="0" relativeHeight="251675648" behindDoc="0" locked="0" layoutInCell="1" allowOverlap="1" wp14:anchorId="123D5EED" wp14:editId="576F6D4F">
+              <wp:anchor distT="0" distB="0" distL="114300" distR="114300" simplePos="0" relativeHeight="251674624" behindDoc="0" locked="0" layoutInCell="1" allowOverlap="1" wp14:anchorId="123D5EED" wp14:editId="02EB2922">
                 <wp:simplePos x="0" y="0"/>
                 <wp:positionH relativeFrom="column">
                   <wp:posOffset>2914015</wp:posOffset>
@@ -6077,7 +6084,7 @@
           </mc:Choice>
           <mc:Fallback>
             <w:pict>
-              <v:shape w14:anchorId="123D5EED" id="_x0000_s1033" type="#_x0000_t202" style="position:absolute;margin-left:229.45pt;margin-top:111.9pt;width:86.6pt;height:22.8pt;z-index:251675648;visibility:visible;mso-wrap-style:none;mso-width-percent:0;mso-height-percent:0;mso-wrap-distance-left:9pt;mso-wrap-distance-top:0;mso-wrap-distance-right:9pt;mso-wrap-distance-bottom:0;mso-position-horizontal:absolute;mso-position-horizontal-relative:text;mso-position-vertical:absolute;mso-position-vertical-relative:text;mso-width-percent:0;mso-height-percent:0;mso-width-relative:margin;mso-height-relative:margin;v-text-anchor:middle" o:gfxdata="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" fillcolor="#fbf8d8" strokeweight=".5pt">
+              <v:shape w14:anchorId="123D5EED" id="_x0000_s1033" type="#_x0000_t202" style="position:absolute;margin-left:229.45pt;margin-top:111.9pt;width:86.6pt;height:22.8pt;z-index:251674624;visibility:visible;mso-wrap-style:none;mso-width-percent:0;mso-height-percent:0;mso-wrap-distance-left:9pt;mso-wrap-distance-top:0;mso-wrap-distance-right:9pt;mso-wrap-distance-bottom:0;mso-position-horizontal:absolute;mso-position-horizontal-relative:text;mso-position-vertical:absolute;mso-position-vertical-relative:text;mso-width-percent:0;mso-height-percent:0;mso-width-relative:margin;mso-height-relative:margin;v-text-anchor:middle" o:gfxdata="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" fillcolor="#fbf8d8" strokeweight=".5pt">
                 <v:shadow on="t" color="black" opacity="26214f" origin="-.5,-.5" offset=".74836mm,.74836mm"/>
                 <v:textbox style="mso-fit-shape-to-text:t">
                   <w:txbxContent>
@@ -6116,7 +6123,7 @@
         <mc:AlternateContent>
           <mc:Choice Requires="wps">
             <w:drawing>
-              <wp:anchor distT="0" distB="0" distL="114300" distR="114300" simplePos="0" relativeHeight="251674624" behindDoc="0" locked="0" layoutInCell="1" allowOverlap="1" wp14:anchorId="2C0030A6" wp14:editId="1E570941">
+              <wp:anchor distT="0" distB="0" distL="114300" distR="114300" simplePos="0" relativeHeight="251673600" behindDoc="0" locked="0" layoutInCell="1" allowOverlap="1" wp14:anchorId="2C0030A6" wp14:editId="66A92B33">
                 <wp:simplePos x="0" y="0"/>
                 <wp:positionH relativeFrom="column">
                   <wp:posOffset>2632178</wp:posOffset>
@@ -6173,7 +6180,7 @@
           </mc:Choice>
           <mc:Fallback>
             <w:pict>
-              <v:shape w14:anchorId="6F5F46B0" id="Right Brace 20" o:spid="_x0000_s1026" type="#_x0000_t88" style="position:absolute;margin-left:207.25pt;margin-top:89pt;width:16.35pt;height:65.55pt;z-index:251674624;visibility:visible;mso-wrap-style:square;mso-width-percent:0;mso-wrap-distance-left:9pt;mso-wrap-distance-top:0;mso-wrap-distance-right:9pt;mso-wrap-distance-bottom:0;mso-position-horizontal:absolute;mso-position-horizontal-relative:text;mso-position-vertical:absolute;mso-position-vertical-relative:text;mso-width-percent:0;mso-width-relative:margin;v-text-anchor:middle" o:gfxdata="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" adj="449" strokecolor="#4579b8 [3044]"/>
+              <v:shape w14:anchorId="02497E50" id="Right Brace 20" o:spid="_x0000_s1026" type="#_x0000_t88" style="position:absolute;margin-left:207.25pt;margin-top:89pt;width:16.35pt;height:65.55pt;z-index:251673600;visibility:visible;mso-wrap-style:square;mso-width-percent:0;mso-wrap-distance-left:9pt;mso-wrap-distance-top:0;mso-wrap-distance-right:9pt;mso-wrap-distance-bottom:0;mso-position-horizontal:absolute;mso-position-horizontal-relative:text;mso-position-vertical:absolute;mso-position-vertical-relative:text;mso-width-percent:0;mso-width-relative:margin;v-text-anchor:middle" o:gfxdata="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" adj="449" strokecolor="#4579b8 [3044]"/>
             </w:pict>
           </mc:Fallback>
         </mc:AlternateContent>
@@ -7685,7 +7692,7 @@
         <mc:AlternateContent>
           <mc:Choice Requires="wps">
             <w:drawing>
-              <wp:anchor distT="0" distB="0" distL="114300" distR="114300" simplePos="0" relativeHeight="251678720" behindDoc="0" locked="0" layoutInCell="1" allowOverlap="1" wp14:anchorId="123D5EED" wp14:editId="576F6D4F">
+              <wp:anchor distT="0" distB="0" distL="114300" distR="114300" simplePos="0" relativeHeight="251677696" behindDoc="0" locked="0" layoutInCell="1" allowOverlap="1" wp14:anchorId="123D5EED" wp14:editId="156DF285">
                 <wp:simplePos x="0" y="0"/>
                 <wp:positionH relativeFrom="column">
                   <wp:posOffset>3048635</wp:posOffset>
@@ -7768,7 +7775,7 @@
           </mc:Choice>
           <mc:Fallback>
             <w:pict>
-              <v:shape w14:anchorId="123D5EED" id="_x0000_s1036" type="#_x0000_t202" style="position:absolute;margin-left:240.05pt;margin-top:125.2pt;width:86.6pt;height:22.8pt;z-index:251678720;visibility:visible;mso-wrap-style:none;mso-width-percent:0;mso-height-percent:0;mso-wrap-distance-left:9pt;mso-wrap-distance-top:0;mso-wrap-distance-right:9pt;mso-wrap-distance-bottom:0;mso-position-horizontal:absolute;mso-position-horizontal-relative:text;mso-position-vertical:absolute;mso-position-vertical-relative:text;mso-width-percent:0;mso-height-percent:0;mso-width-relative:margin;mso-height-relative:margin;v-text-anchor:middle" o:gfxdata="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" fillcolor="#fbf8d8" strokeweight=".5pt">
+              <v:shape w14:anchorId="123D5EED" id="_x0000_s1036" type="#_x0000_t202" style="position:absolute;margin-left:240.05pt;margin-top:125.2pt;width:86.6pt;height:22.8pt;z-index:251677696;visibility:visible;mso-wrap-style:none;mso-width-percent:0;mso-height-percent:0;mso-wrap-distance-left:9pt;mso-wrap-distance-top:0;mso-wrap-distance-right:9pt;mso-wrap-distance-bottom:0;mso-position-horizontal:absolute;mso-position-horizontal-relative:text;mso-position-vertical:absolute;mso-position-vertical-relative:text;mso-width-percent:0;mso-height-percent:0;mso-width-relative:margin;mso-height-relative:margin;v-text-anchor:middle" o:gfxdata="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" fillcolor="#fbf8d8" strokeweight=".5pt">
                 <v:shadow on="t" color="black" opacity="26214f" origin="-.5,-.5" offset=".74836mm,.74836mm"/>
                 <v:textbox style="mso-fit-shape-to-text:t">
                   <w:txbxContent>
@@ -7807,7 +7814,7 @@
         <mc:AlternateContent>
           <mc:Choice Requires="wps">
             <w:drawing>
-              <wp:anchor distT="0" distB="0" distL="114300" distR="114300" simplePos="0" relativeHeight="251677696" behindDoc="0" locked="0" layoutInCell="1" allowOverlap="1" wp14:anchorId="2C0030A6" wp14:editId="1E570941">
+              <wp:anchor distT="0" distB="0" distL="114300" distR="114300" simplePos="0" relativeHeight="251676672" behindDoc="0" locked="0" layoutInCell="1" allowOverlap="1" wp14:anchorId="2C0030A6" wp14:editId="1295BC85">
                 <wp:simplePos x="0" y="0"/>
                 <wp:positionH relativeFrom="column">
                   <wp:posOffset>2766695</wp:posOffset>
@@ -7864,7 +7871,7 @@
           </mc:Choice>
           <mc:Fallback>
             <w:pict>
-              <v:shape w14:anchorId="1FA29C45" id="Right Brace 20" o:spid="_x0000_s1026" type="#_x0000_t88" style="position:absolute;margin-left:217.85pt;margin-top:102.2pt;width:16.35pt;height:65.55pt;z-index:251677696;visibility:visible;mso-wrap-style:square;mso-width-percent:0;mso-wrap-distance-left:9pt;mso-wrap-distance-top:0;mso-wrap-distance-right:9pt;mso-wrap-distance-bottom:0;mso-position-horizontal:absolute;mso-position-horizontal-relative:text;mso-position-vertical:absolute;mso-position-vertical-relative:text;mso-width-percent:0;mso-width-relative:margin;v-text-anchor:middle" o:gfxdata="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" adj="449" strokecolor="#4579b8 [3044]"/>
+              <v:shape w14:anchorId="3BEE3DD4" id="Right Brace 20" o:spid="_x0000_s1026" type="#_x0000_t88" style="position:absolute;margin-left:217.85pt;margin-top:102.2pt;width:16.35pt;height:65.55pt;z-index:251676672;visibility:visible;mso-wrap-style:square;mso-width-percent:0;mso-wrap-distance-left:9pt;mso-wrap-distance-top:0;mso-wrap-distance-right:9pt;mso-wrap-distance-bottom:0;mso-position-horizontal:absolute;mso-position-horizontal-relative:text;mso-position-vertical:absolute;mso-position-vertical-relative:text;mso-width-percent:0;mso-width-relative:margin;v-text-anchor:middle" o:gfxdata="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" adj="449" strokecolor="#4579b8 [3044]"/>
             </w:pict>
           </mc:Fallback>
         </mc:AlternateContent>
@@ -15284,7 +15291,6 @@
   <w:style w:type="character" w:default="1" w:styleId="DefaultParagraphFont">
     <w:name w:val="Default Paragraph Font"/>
     <w:uiPriority w:val="1"/>
-    <w:semiHidden/>
     <w:unhideWhenUsed/>
   </w:style>
   <w:style w:type="table" w:default="1" w:styleId="TableNormal">

</xml_diff>

<commit_message>
Ed25519 alg id changed
</commit_message>
<xml_diff>
--- a/defensive-publications/partial-encryption-full-signature.docx
+++ b/defensive-publications/partial-encryption-full-signature.docx
@@ -4767,7 +4767,25 @@
                                 <w:szCs w:val="20"/>
                               </w:rPr>
                               <w:br/>
-                              <w:t>    1: -50,</w:t>
+                              <w:t>    1: </w:t>
+                            </w:r>
+                            <w:r>
+                              <w:rPr>
+                                <w:rFonts w:ascii="Consolas" w:hAnsi="Consolas" w:cs="Consolas"/>
+                                <w:noProof/>
+                                <w:sz w:val="20"/>
+                                <w:szCs w:val="20"/>
+                              </w:rPr>
+                              <w:t>-19</w:t>
+                            </w:r>
+                            <w:r>
+                              <w:rPr>
+                                <w:rFonts w:ascii="Consolas" w:hAnsi="Consolas" w:cs="Consolas"/>
+                                <w:noProof/>
+                                <w:sz w:val="20"/>
+                                <w:szCs w:val="20"/>
+                              </w:rPr>
+                              <w:t>,</w:t>
                             </w:r>
                             <w:r>
                               <w:rPr>
@@ -4943,7 +4961,11 @@
           </mc:Choice>
           <mc:Fallback>
             <w:pict>
-              <v:shape w14:anchorId="04423971" id="_x0000_s1032" type="#_x0000_t202" style="width:507pt;height:24.15pt;visibility:visible;mso-wrap-style:square;mso-left-percent:-10001;mso-top-percent:-10001;mso-position-horizontal:absolute;mso-position-horizontal-relative:char;mso-position-vertical:absolute;mso-position-vertical-relative:line;mso-left-percent:-10001;mso-top-percent:-10001;v-text-anchor:top" o:gfxdata="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" fillcolor="#f7f7f7" strokeweight=".5pt">
+              <v:shapetype w14:anchorId="04423971" id="_x0000_t202" coordsize="21600,21600" o:spt="202" path="m,l,21600r21600,l21600,xe">
+                <v:stroke joinstyle="miter"/>
+                <v:path gradientshapeok="t" o:connecttype="rect"/>
+              </v:shapetype>
+              <v:shape id="_x0000_s1032" type="#_x0000_t202" style="width:507pt;height:24.15pt;visibility:visible;mso-wrap-style:square;mso-left-percent:-10001;mso-top-percent:-10001;mso-position-horizontal:absolute;mso-position-horizontal-relative:char;mso-position-vertical:absolute;mso-position-vertical-relative:line;mso-left-percent:-10001;mso-top-percent:-10001;v-text-anchor:top" o:gfxdata="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" fillcolor="#f7f7f7" strokeweight=".5pt">
                 <v:shadow on="t" color="black" opacity="26214f" origin="-.5,-.5" offset=".74836mm,.74836mm"/>
                 <v:textbox style="mso-fit-shape-to-text:t">
                   <w:txbxContent>
@@ -5198,7 +5220,25 @@
                           <w:szCs w:val="20"/>
                         </w:rPr>
                         <w:br/>
-                        <w:t>    1: -50,</w:t>
+                        <w:t>    1: </w:t>
+                      </w:r>
+                      <w:r>
+                        <w:rPr>
+                          <w:rFonts w:ascii="Consolas" w:hAnsi="Consolas" w:cs="Consolas"/>
+                          <w:noProof/>
+                          <w:sz w:val="20"/>
+                          <w:szCs w:val="20"/>
+                        </w:rPr>
+                        <w:t>-19</w:t>
+                      </w:r>
+                      <w:r>
+                        <w:rPr>
+                          <w:rFonts w:ascii="Consolas" w:hAnsi="Consolas" w:cs="Consolas"/>
+                          <w:noProof/>
+                          <w:sz w:val="20"/>
+                          <w:szCs w:val="20"/>
+                        </w:rPr>
+                        <w:t>,</w:t>
                       </w:r>
                       <w:r>
                         <w:rPr>
@@ -5570,7 +5610,25 @@
           <w:sz w:val="20"/>
           <w:szCs w:val="20"/>
         </w:rPr>
-        <w:t xml:space="preserve"> (1: -50)</w:t>
+        <w:t xml:space="preserve"> (1: </w:t>
+      </w:r>
+      <w:r>
+        <w:rPr>
+          <w:rFonts w:ascii="Arial" w:hAnsi="Arial" w:cs="Arial"/>
+          <w:iCs/>
+          <w:sz w:val="20"/>
+          <w:szCs w:val="20"/>
+        </w:rPr>
+        <w:t>-19</w:t>
+      </w:r>
+      <w:r>
+        <w:rPr>
+          <w:rFonts w:ascii="Arial" w:hAnsi="Arial" w:cs="Arial"/>
+          <w:iCs/>
+          <w:sz w:val="20"/>
+          <w:szCs w:val="20"/>
+        </w:rPr>
+        <w:t>)</w:t>
       </w:r>
       <w:r>
         <w:rPr>
@@ -7178,7 +7236,25 @@
                                 <w:szCs w:val="20"/>
                               </w:rPr>
                               <w:br/>
-                              <w:t>    1: -50,</w:t>
+                              <w:t>    1: </w:t>
+                            </w:r>
+                            <w:r>
+                              <w:rPr>
+                                <w:rFonts w:ascii="Consolas" w:hAnsi="Consolas" w:cs="Consolas"/>
+                                <w:noProof/>
+                                <w:sz w:val="20"/>
+                                <w:szCs w:val="20"/>
+                              </w:rPr>
+                              <w:t>-19</w:t>
+                            </w:r>
+                            <w:r>
+                              <w:rPr>
+                                <w:rFonts w:ascii="Consolas" w:hAnsi="Consolas" w:cs="Consolas"/>
+                                <w:noProof/>
+                                <w:sz w:val="20"/>
+                                <w:szCs w:val="20"/>
+                              </w:rPr>
+                              <w:t>,</w:t>
                             </w:r>
                             <w:r>
                               <w:rPr>
@@ -7480,7 +7556,25 @@
                           <w:szCs w:val="20"/>
                         </w:rPr>
                         <w:br/>
-                        <w:t>    1: -50,</w:t>
+                        <w:t>    1: </w:t>
+                      </w:r>
+                      <w:r>
+                        <w:rPr>
+                          <w:rFonts w:ascii="Consolas" w:hAnsi="Consolas" w:cs="Consolas"/>
+                          <w:noProof/>
+                          <w:sz w:val="20"/>
+                          <w:szCs w:val="20"/>
+                        </w:rPr>
+                        <w:t>-19</w:t>
+                      </w:r>
+                      <w:r>
+                        <w:rPr>
+                          <w:rFonts w:ascii="Consolas" w:hAnsi="Consolas" w:cs="Consolas"/>
+                          <w:noProof/>
+                          <w:sz w:val="20"/>
+                          <w:szCs w:val="20"/>
+                        </w:rPr>
+                        <w:t>,</w:t>
                       </w:r>
                       <w:r>
                         <w:rPr>

</xml_diff>